<commit_message>
cases: refresh Decision Framing Questions across the remaining 18 case docs
</commit_message>
<xml_diff>
--- a/assets/cases/Aurora_Motors_Flow_Coordination_Case.docx
+++ b/assets/cases/Aurora_Motors_Flow_Coordination_Case.docx
@@ -2356,7 +2356,7 @@
         <w:spacing w:line="247" w:lineRule="auto"/>
       </w:pPr>
       <w:r>
-        <w:t>Identify the different metrics that can be used to evaluate every aspect of the performance of the system?  Organize these into a pyramid to indicate the relative importance, following the style given here.</w:t>
+        <w:t xml:space="preserve">Identify and describe the responsibilities of the decision maker. This should set the scope of the problem.</w:t>
       </w:r>
     </w:p>
     <w:p>
@@ -2369,29 +2369,18 @@
         <w:spacing w:line="247" w:lineRule="auto"/>
       </w:pPr>
       <w:r>
-        <w:t xml:space="preserve">What are the types of decisions? Use the </w:t>
+        <w:t xml:space="preserve">Use the </w:t>
       </w:r>
-      <w:hyperlink r:id="rId8" w:anchor="types-of-decision-settings" w:history="1">
+      <w:hyperlink r:id="rId20">
         <w:r>
           <w:rPr>
             <w:rStyle w:val="Hyperlink"/>
           </w:rPr>
-          <w:t>list of decision types here as a guide</w:t>
+          <w:t xml:space="preserve">metrics pyramid tool</w:t>
         </w:r>
       </w:hyperlink>
       <w:r>
-        <w:t xml:space="preserve">, illustrated by the </w:t>
-      </w:r>
-      <w:hyperlink r:id="rId9" w:anchor="from-apps-to-types" w:history="1">
-        <w:r>
-          <w:rPr>
-            <w:rStyle w:val="Hyperlink"/>
-          </w:rPr>
-          <w:t>applications here</w:t>
-        </w:r>
-      </w:hyperlink>
-      <w:r>
-        <w:t xml:space="preserve">.  </w:t>
+        <w:t xml:space="preserve"> to identify and prioritize the different performance metrics. Click on the oval holding the metric to identify whether it is a metric to be maximized (green), minimized (red), a target that is a floor (light green) or a ceiling (light red), or finally a target (purple).</w:t>
       </w:r>
     </w:p>
     <w:p>
@@ -2406,16 +2395,27 @@
       <w:r>
         <w:t xml:space="preserve">Use the </w:t>
       </w:r>
-      <w:hyperlink r:id="rId10" w:history="1">
+      <w:hyperlink r:id="rId21">
         <w:r>
           <w:rPr>
             <w:rStyle w:val="Hyperlink"/>
           </w:rPr>
-          <w:t>interactive framing matrix here</w:t>
+          <w:t xml:space="preserve">decision prioritization tool</w:t>
         </w:r>
       </w:hyperlink>
       <w:r>
-        <w:t xml:space="preserve"> to fill out the performance metrics along the top (from most to least important) followed by the list of decisions (in any order).  Use your judgment to assess whether the impact of each decision on each metric is H (high impact), M (medium), L (low) or N (none).  Finally, use the resulting matrix to rank the decisions in terms of their impact on the most important metrics.</w:t>
+        <w:t xml:space="preserve"> to first list the different types of decisions (use the </w:t>
+      </w:r>
+      <w:hyperlink r:id="rId22">
+        <w:r>
+          <w:rPr>
+            <w:rStyle w:val="Hyperlink"/>
+          </w:rPr>
+          <w:t xml:space="preserve">types of decisions</w:t>
+        </w:r>
+      </w:hyperlink>
+      <w:r>
+        <w:t xml:space="preserve"> as a guide). These will then populate the rows of the matrix to the right, where the columns are the performance metrics sorted left to right by the priority in the pyramid above. Click on each cell to indicate if the impact of the decision on each metric is high (red), medium (orange), low (yellow) or none (white).</w:t>
       </w:r>
     </w:p>
     <w:p>
@@ -2428,18 +2428,7 @@
         <w:spacing w:line="247" w:lineRule="auto"/>
       </w:pPr>
       <w:r>
-        <w:t xml:space="preserve">What are the different sources of uncertainty?  Use the </w:t>
-      </w:r>
-      <w:hyperlink r:id="rId11" w:anchor="categories" w:history="1">
-        <w:r>
-          <w:rPr>
-            <w:rStyle w:val="Hyperlink"/>
-          </w:rPr>
-          <w:t>12 categories of uncertainty here as a guide</w:t>
-        </w:r>
-      </w:hyperlink>
-      <w:r>
-        <w:t>.</w:t>
+        <w:t xml:space="preserve">You can grab the handle (three bars) farthest to the left on each row to move it up or down. Sort the rows so that the decisions with the greatest impact on the most important metrics are toward the top. The cells in the upper left-hand corner should have the greatest concentration of red and orange cells. At this point identify the decisions that should receive the most attention in your study. If you do not have any decisions with a medium or high impact on the most important metrics, revisit your list of decisions.</w:t>
       </w:r>
     </w:p>
     <w:p>
@@ -2452,7 +2441,42 @@
         <w:spacing w:line="247" w:lineRule="auto"/>
       </w:pPr>
       <w:r>
-        <w:t>Repeat the exercise in (3), but this time using uncertainties instead of decisions.</w:t>
+        <w:t xml:space="preserve">Repeat the process to list and prioritize the uncertainties using the </w:t>
+      </w:r>
+      <w:hyperlink r:id="rId23">
+        <w:r>
+          <w:rPr>
+            <w:rStyle w:val="Hyperlink"/>
+          </w:rPr>
+          <w:t xml:space="preserve">uncertainty prioritization tool</w:t>
+        </w:r>
+      </w:hyperlink>
+      <w:r>
+        <w:t xml:space="preserve">. Use the </w:t>
+      </w:r>
+      <w:hyperlink r:id="rId24">
+        <w:r>
+          <w:rPr>
+            <w:rStyle w:val="Hyperlink"/>
+          </w:rPr>
+          <w:t xml:space="preserve">categories of uncertainty</w:t>
+        </w:r>
+      </w:hyperlink>
+      <w:r>
+        <w:t xml:space="preserve"> to help you identify these.</w:t>
+      </w:r>
+    </w:p>
+    <w:p>
+      <w:pPr>
+        <w:pStyle w:val="ListParagraph"/>
+        <w:numPr>
+          <w:ilvl w:val="0"/>
+          <w:numId w:val="11"/>
+        </w:numPr>
+        <w:spacing w:line="247" w:lineRule="auto"/>
+      </w:pPr>
+      <w:r>
+        <w:t xml:space="preserve">It is important to differentiate uncertainties that can be evaluated on average, or as risk events:</w:t>
       </w:r>
     </w:p>
     <w:p>
@@ -2465,7 +2489,7 @@
         <w:spacing w:line="247" w:lineRule="auto"/>
       </w:pPr>
       <w:r>
-        <w:t>Which sources of uncertainty would be captured using average performance over time?</w:t>
+        <w:t xml:space="preserve">Which sources of uncertainty would be captured using average performance over time?</w:t>
       </w:r>
     </w:p>
     <w:p>
@@ -2478,7 +2502,7 @@
         <w:spacing w:line="247" w:lineRule="auto"/>
       </w:pPr>
       <w:r>
-        <w:t>Which sources of uncertainty represent forms of risk that are not properly captured using averages?</w:t>
+        <w:t xml:space="preserve">Which sources of uncertainty represent forms of risk that are not properly captured using averages?</w:t>
       </w:r>
     </w:p>
     <w:p>
@@ -2491,7 +2515,7 @@
         <w:spacing w:line="247" w:lineRule="auto"/>
       </w:pPr>
       <w:r>
-        <w:t xml:space="preserve">Choose the single decision that seems to have the highest impact on the most important metric.  </w:t>
+        <w:t xml:space="preserve">Choose the single decision that seems to have the highest impact on the most important metric.</w:t>
       </w:r>
     </w:p>
     <w:p>
@@ -2504,7 +2528,7 @@
         <w:spacing w:line="247" w:lineRule="auto"/>
       </w:pPr>
       <w:r>
-        <w:t>What approach do you think you would use to make this decision?</w:t>
+        <w:t xml:space="preserve">What approach do you think you would use to make this decision?</w:t>
       </w:r>
     </w:p>
     <w:p>
@@ -2517,7 +2541,7 @@
         <w:spacing w:line="247" w:lineRule="auto"/>
       </w:pPr>
       <w:r>
-        <w:t>What data appears to be necessary to make this decision, including the calculation of any performance metrics where the decision would have a high or medium impact.</w:t>
+        <w:t xml:space="preserve">What data appears to be necessary to make this decision, including the calculation of any performance metrics where the decision would have a high or medium impact.</w:t>
       </w:r>
     </w:p>
     <w:p>
@@ -2530,7 +2554,7 @@
         <w:spacing w:line="247" w:lineRule="auto"/>
       </w:pPr>
       <w:r>
-        <w:t>Using the same decision you identified in (6), identify the people, departments, groups or organizations that you would need to work with to implement the decision?</w:t>
+        <w:t xml:space="preserve">Using the same decision you identified in (7), identify the people, departments, groups or organizations that you would need to work with to implement the decision.</w:t>
       </w:r>
     </w:p>
     <w:p>

</xml_diff>